<commit_message>
feat: add MATLAB实验8/9, update DSP materials and README
</commit_message>
<xml_diff>
--- a/数字信号处理/大三下matlab实验/7/实验2 用FFT进行频谱分析（第四章）-测控2302-学生版.docx
+++ b/数字信号处理/大三下matlab实验/7/实验2 用FFT进行频谱分析（第四章）-测控2302-学生版.docx
@@ -503,10 +503,10 @@
             <v:path o:extrusionok="f" gradientshapeok="t" o:connecttype="rect"/>
             <o:lock v:ext="edit" aspectratio="t"/>
           </v:shapetype>
-          <v:shape id="_x0000_i1025" type="#_x0000_t75" style="width:23pt;height:17pt" o:ole="">
-            <v:imagedata r:id="rId6" o:title=""/>
+          <v:shape id="_x0000_i1025" type="#_x0000_t75" style="width:23.25pt;height:17.15pt" o:ole="">
+            <v:imagedata r:id="rId8" o:title=""/>
           </v:shape>
-          <o:OLEObject Type="Embed" ProgID="Equation.3" ShapeID="_x0000_i1025" DrawAspect="Content" ObjectID="_1840520095" r:id="rId7"/>
+          <o:OLEObject Type="Embed" ProgID="Equation.3" ShapeID="_x0000_i1025" DrawAspect="Content" ObjectID="_1840865205" r:id="rId9"/>
         </w:object>
       </w:r>
       <w:r>
@@ -1006,54 +1006,17 @@
           <w:position w:val="-10"/>
         </w:rPr>
         <w:object w:dxaOrig="1340" w:dyaOrig="340" w14:anchorId="3A7EAA3E">
-          <v:shape id="_x0000_i1026" type="#_x0000_t75" style="width:67pt;height:17pt" o:ole="">
-            <v:imagedata r:id="rId8" o:title=""/>
-          </v:shape>
-          <o:OLEObject Type="Embed" ProgID="Equation.3" ShapeID="_x0000_i1026" DrawAspect="Content" ObjectID="_1840520096" r:id="rId9"/>
-        </w:object>
-      </w:r>
-      <w:r>
-        <w:rPr>
-          <w:rFonts w:hint="eastAsia"/>
-        </w:rPr>
-        <w:t xml:space="preserve"> </w:t>
-      </w:r>
-    </w:p>
-    <w:p>
-      <w:r>
-        <w:rPr>
-          <w:rFonts w:hint="eastAsia"/>
-        </w:rPr>
-        <w:t>（</w:t>
-      </w:r>
-      <w:r>
-        <w:rPr>
-          <w:rFonts w:hint="eastAsia"/>
-        </w:rPr>
-        <w:t>2</w:t>
-      </w:r>
-      <w:r>
-        <w:rPr>
-          <w:rFonts w:hint="eastAsia"/>
-        </w:rPr>
-        <w:t>）</w:t>
-      </w:r>
-      <w:r>
-        <w:rPr>
-          <w:position w:val="-50"/>
-        </w:rPr>
-        <w:object w:dxaOrig="2520" w:dyaOrig="1120" w14:anchorId="2855E22B">
-          <v:shape id="_x0000_i1027" type="#_x0000_t75" style="width:126pt;height:56pt" o:ole="">
+          <v:shape id="_x0000_i1026" type="#_x0000_t75" style="width:67pt;height:17.15pt" o:ole="">
             <v:imagedata r:id="rId10" o:title=""/>
           </v:shape>
-          <o:OLEObject Type="Embed" ProgID="Equation.3" ShapeID="_x0000_i1027" DrawAspect="Content" ObjectID="_1840520097" r:id="rId11"/>
+          <o:OLEObject Type="Embed" ProgID="Equation.3" ShapeID="_x0000_i1026" DrawAspect="Content" ObjectID="_1840865206" r:id="rId11"/>
         </w:object>
       </w:r>
       <w:r>
         <w:rPr>
           <w:rFonts w:hint="eastAsia"/>
         </w:rPr>
-        <w:t xml:space="preserve">     </w:t>
+        <w:t xml:space="preserve"> </w:t>
       </w:r>
     </w:p>
     <w:p>
@@ -1067,7 +1030,7 @@
         <w:rPr>
           <w:rFonts w:hint="eastAsia"/>
         </w:rPr>
-        <w:t>3</w:t>
+        <w:t>2</w:t>
       </w:r>
       <w:r>
         <w:rPr>
@@ -1079,11 +1042,48 @@
         <w:rPr>
           <w:position w:val="-50"/>
         </w:rPr>
-        <w:object w:dxaOrig="2560" w:dyaOrig="1120" w14:anchorId="01D256B4">
-          <v:shape id="_x0000_i1028" type="#_x0000_t75" style="width:128pt;height:56pt" o:ole="">
+        <w:object w:dxaOrig="2520" w:dyaOrig="1120" w14:anchorId="2855E22B">
+          <v:shape id="_x0000_i1027" type="#_x0000_t75" style="width:126.3pt;height:55.95pt" o:ole="">
             <v:imagedata r:id="rId12" o:title=""/>
           </v:shape>
-          <o:OLEObject Type="Embed" ProgID="Equation.3" ShapeID="_x0000_i1028" DrawAspect="Content" ObjectID="_1840520098" r:id="rId13"/>
+          <o:OLEObject Type="Embed" ProgID="Equation.3" ShapeID="_x0000_i1027" DrawAspect="Content" ObjectID="_1840865207" r:id="rId13"/>
+        </w:object>
+      </w:r>
+      <w:r>
+        <w:rPr>
+          <w:rFonts w:hint="eastAsia"/>
+        </w:rPr>
+        <w:t xml:space="preserve">     </w:t>
+      </w:r>
+    </w:p>
+    <w:p>
+      <w:r>
+        <w:rPr>
+          <w:rFonts w:hint="eastAsia"/>
+        </w:rPr>
+        <w:t>（</w:t>
+      </w:r>
+      <w:r>
+        <w:rPr>
+          <w:rFonts w:hint="eastAsia"/>
+        </w:rPr>
+        <w:t>3</w:t>
+      </w:r>
+      <w:r>
+        <w:rPr>
+          <w:rFonts w:hint="eastAsia"/>
+        </w:rPr>
+        <w:t>）</w:t>
+      </w:r>
+      <w:r>
+        <w:rPr>
+          <w:position w:val="-50"/>
+        </w:rPr>
+        <w:object w:dxaOrig="2560" w:dyaOrig="1120" w14:anchorId="01D256B4">
+          <v:shape id="_x0000_i1028" type="#_x0000_t75" style="width:127.95pt;height:55.95pt" o:ole="">
+            <v:imagedata r:id="rId14" o:title=""/>
+          </v:shape>
+          <o:OLEObject Type="Embed" ProgID="Equation.3" ShapeID="_x0000_i1028" DrawAspect="Content" ObjectID="_1840865208" r:id="rId15"/>
         </w:object>
       </w:r>
       <w:r>
@@ -1257,47 +1257,10 @@
           <w:position w:val="-24"/>
         </w:rPr>
         <w:object w:dxaOrig="1520" w:dyaOrig="620" w14:anchorId="7D54EB03">
-          <v:shape id="_x0000_i1029" type="#_x0000_t75" style="width:76pt;height:31pt" o:ole="">
-            <v:imagedata r:id="rId14" o:title=""/>
-          </v:shape>
-          <o:OLEObject Type="Embed" ProgID="Equation.3" ShapeID="_x0000_i1029" DrawAspect="Content" ObjectID="_1840520099" r:id="rId15"/>
-        </w:object>
-      </w:r>
-      <w:r>
-        <w:rPr>
-          <w:rFonts w:hint="eastAsia"/>
-        </w:rPr>
-        <w:t xml:space="preserve"> </w:t>
-      </w:r>
-    </w:p>
-    <w:p>
-      <w:r>
-        <w:rPr>
-          <w:rFonts w:hint="eastAsia"/>
-        </w:rPr>
-        <w:t>（</w:t>
-      </w:r>
-      <w:r>
-        <w:rPr>
-          <w:rFonts w:hint="eastAsia"/>
-        </w:rPr>
-        <w:t>5</w:t>
-      </w:r>
-      <w:r>
-        <w:rPr>
-          <w:rFonts w:hint="eastAsia"/>
-        </w:rPr>
-        <w:t>）</w:t>
-      </w:r>
-      <w:r>
-        <w:rPr>
-          <w:position w:val="-24"/>
-        </w:rPr>
-        <w:object w:dxaOrig="1480" w:dyaOrig="620" w14:anchorId="3DC8D810">
-          <v:shape id="_x0000_i1030" type="#_x0000_t75" style="width:74pt;height:31pt" o:ole="">
+          <v:shape id="_x0000_i1029" type="#_x0000_t75" style="width:75.9pt;height:31pt" o:ole="">
             <v:imagedata r:id="rId16" o:title=""/>
           </v:shape>
-          <o:OLEObject Type="Embed" ProgID="Equation.3" ShapeID="_x0000_i1030" DrawAspect="Content" ObjectID="_1840520100" r:id="rId17"/>
+          <o:OLEObject Type="Embed" ProgID="Equation.3" ShapeID="_x0000_i1029" DrawAspect="Content" ObjectID="_1840865209" r:id="rId17"/>
         </w:object>
       </w:r>
       <w:r>
@@ -1318,7 +1281,7 @@
         <w:rPr>
           <w:rFonts w:hint="eastAsia"/>
         </w:rPr>
-        <w:t>6</w:t>
+        <w:t>5</w:t>
       </w:r>
       <w:r>
         <w:rPr>
@@ -1328,13 +1291,50 @@
       </w:r>
       <w:r>
         <w:rPr>
-          <w:position w:val="-12"/>
-        </w:rPr>
-        <w:object w:dxaOrig="3440" w:dyaOrig="360" w14:anchorId="5D15C609">
-          <v:shape id="_x0000_i1031" type="#_x0000_t75" style="width:172pt;height:18pt" o:ole="">
+          <w:position w:val="-24"/>
+        </w:rPr>
+        <w:object w:dxaOrig="1480" w:dyaOrig="620" w14:anchorId="3DC8D810">
+          <v:shape id="_x0000_i1030" type="#_x0000_t75" style="width:74.2pt;height:31pt" o:ole="">
             <v:imagedata r:id="rId18" o:title=""/>
           </v:shape>
-          <o:OLEObject Type="Embed" ProgID="Equation.3" ShapeID="_x0000_i1031" DrawAspect="Content" ObjectID="_1840520101" r:id="rId19"/>
+          <o:OLEObject Type="Embed" ProgID="Equation.3" ShapeID="_x0000_i1030" DrawAspect="Content" ObjectID="_1840865210" r:id="rId19"/>
+        </w:object>
+      </w:r>
+      <w:r>
+        <w:rPr>
+          <w:rFonts w:hint="eastAsia"/>
+        </w:rPr>
+        <w:t xml:space="preserve"> </w:t>
+      </w:r>
+    </w:p>
+    <w:p>
+      <w:r>
+        <w:rPr>
+          <w:rFonts w:hint="eastAsia"/>
+        </w:rPr>
+        <w:t>（</w:t>
+      </w:r>
+      <w:r>
+        <w:rPr>
+          <w:rFonts w:hint="eastAsia"/>
+        </w:rPr>
+        <w:t>6</w:t>
+      </w:r>
+      <w:r>
+        <w:rPr>
+          <w:rFonts w:hint="eastAsia"/>
+        </w:rPr>
+        <w:t>）</w:t>
+      </w:r>
+      <w:r>
+        <w:rPr>
+          <w:position w:val="-12"/>
+        </w:rPr>
+        <w:object w:dxaOrig="3440" w:dyaOrig="360" w14:anchorId="5D15C609">
+          <v:shape id="_x0000_i1031" type="#_x0000_t75" style="width:172.25pt;height:18.3pt" o:ole="">
+            <v:imagedata r:id="rId20" o:title=""/>
+          </v:shape>
+          <o:OLEObject Type="Embed" ProgID="Equation.3" ShapeID="_x0000_i1031" DrawAspect="Content" ObjectID="_1840865211" r:id="rId21"/>
         </w:object>
       </w:r>
       <w:r>
@@ -2627,27 +2627,10 @@
           <w:position w:val="-10"/>
         </w:rPr>
         <w:object w:dxaOrig="540" w:dyaOrig="340" w14:anchorId="4AF570CB">
-          <v:shape id="_x0000_i1032" type="#_x0000_t75" style="width:27pt;height:17pt" o:ole="">
-            <v:imagedata r:id="rId20" o:title=""/>
-          </v:shape>
-          <o:OLEObject Type="Embed" ProgID="Equation.3" ShapeID="_x0000_i1032" DrawAspect="Content" ObjectID="_1840520102" r:id="rId21"/>
-        </w:object>
-      </w:r>
-      <w:r>
-        <w:rPr>
-          <w:rFonts w:hint="eastAsia"/>
-        </w:rPr>
-        <w:t>，</w:t>
-      </w:r>
-      <w:r>
-        <w:rPr>
-          <w:position w:val="-10"/>
-        </w:rPr>
-        <w:object w:dxaOrig="580" w:dyaOrig="340" w14:anchorId="44F4F5E3">
-          <v:shape id="_x0000_i1033" type="#_x0000_t75" style="width:29pt;height:17pt" o:ole="">
+          <v:shape id="_x0000_i1032" type="#_x0000_t75" style="width:27.15pt;height:17.15pt" o:ole="">
             <v:imagedata r:id="rId22" o:title=""/>
           </v:shape>
-          <o:OLEObject Type="Embed" ProgID="Equation.3" ShapeID="_x0000_i1033" DrawAspect="Content" ObjectID="_1840520103" r:id="rId23"/>
+          <o:OLEObject Type="Embed" ProgID="Equation.3" ShapeID="_x0000_i1032" DrawAspect="Content" ObjectID="_1840865212" r:id="rId23"/>
         </w:object>
       </w:r>
       <w:r>
@@ -2658,13 +2641,13 @@
       </w:r>
       <w:r>
         <w:rPr>
-          <w:position w:val="-12"/>
-        </w:rPr>
-        <w:object w:dxaOrig="560" w:dyaOrig="360" w14:anchorId="0489CCA7">
-          <v:shape id="_x0000_i1034" type="#_x0000_t75" style="width:28pt;height:18pt" o:ole="">
+          <w:position w:val="-10"/>
+        </w:rPr>
+        <w:object w:dxaOrig="580" w:dyaOrig="340" w14:anchorId="44F4F5E3">
+          <v:shape id="_x0000_i1033" type="#_x0000_t75" style="width:28.8pt;height:17.15pt" o:ole="">
             <v:imagedata r:id="rId24" o:title=""/>
           </v:shape>
-          <o:OLEObject Type="Embed" ProgID="Equation.3" ShapeID="_x0000_i1034" DrawAspect="Content" ObjectID="_1840520104" r:id="rId25"/>
+          <o:OLEObject Type="Embed" ProgID="Equation.3" ShapeID="_x0000_i1033" DrawAspect="Content" ObjectID="_1840865213" r:id="rId25"/>
         </w:object>
       </w:r>
       <w:r>
@@ -2675,13 +2658,13 @@
       </w:r>
       <w:r>
         <w:rPr>
-          <w:position w:val="-10"/>
-        </w:rPr>
-        <w:object w:dxaOrig="580" w:dyaOrig="340" w14:anchorId="357CC536">
-          <v:shape id="_x0000_i1035" type="#_x0000_t75" style="width:29pt;height:17pt" o:ole="">
+          <w:position w:val="-12"/>
+        </w:rPr>
+        <w:object w:dxaOrig="560" w:dyaOrig="360" w14:anchorId="0489CCA7">
+          <v:shape id="_x0000_i1034" type="#_x0000_t75" style="width:28.25pt;height:18.3pt" o:ole="">
             <v:imagedata r:id="rId26" o:title=""/>
           </v:shape>
-          <o:OLEObject Type="Embed" ProgID="Equation.3" ShapeID="_x0000_i1035" DrawAspect="Content" ObjectID="_1840520105" r:id="rId27"/>
+          <o:OLEObject Type="Embed" ProgID="Equation.3" ShapeID="_x0000_i1034" DrawAspect="Content" ObjectID="_1840865214" r:id="rId27"/>
         </w:object>
       </w:r>
       <w:r>
@@ -2692,36 +2675,53 @@
       </w:r>
       <w:r>
         <w:rPr>
-          <w:position w:val="-12"/>
-        </w:rPr>
-        <w:object w:dxaOrig="560" w:dyaOrig="360" w14:anchorId="0EA67858">
-          <v:shape id="_x0000_i1036" type="#_x0000_t75" style="width:28pt;height:18pt" o:ole="">
+          <w:position w:val="-10"/>
+        </w:rPr>
+        <w:object w:dxaOrig="580" w:dyaOrig="340" w14:anchorId="357CC536">
+          <v:shape id="_x0000_i1035" type="#_x0000_t75" style="width:28.8pt;height:17.15pt" o:ole="">
             <v:imagedata r:id="rId28" o:title=""/>
           </v:shape>
-          <o:OLEObject Type="Embed" ProgID="Equation.3" ShapeID="_x0000_i1036" DrawAspect="Content" ObjectID="_1840520106" r:id="rId29"/>
+          <o:OLEObject Type="Embed" ProgID="Equation.3" ShapeID="_x0000_i1035" DrawAspect="Content" ObjectID="_1840865215" r:id="rId29"/>
         </w:object>
       </w:r>
       <w:r>
         <w:rPr>
           <w:rFonts w:hint="eastAsia"/>
         </w:rPr>
-        <w:t xml:space="preserve"> </w:t>
-      </w:r>
-      <w:r>
-        <w:rPr>
-          <w:rFonts w:hint="eastAsia"/>
-        </w:rPr>
-        <w:t>：</w:t>
-      </w:r>
-      <w:r>
-        <w:rPr>
-          <w:position w:val="-10"/>
-        </w:rPr>
-        <w:object w:dxaOrig="900" w:dyaOrig="320" w14:anchorId="236385A3">
-          <v:shape id="_x0000_i1037" type="#_x0000_t75" style="width:45pt;height:16pt" o:ole="">
+        <w:t>，</w:t>
+      </w:r>
+      <w:r>
+        <w:rPr>
+          <w:position w:val="-12"/>
+        </w:rPr>
+        <w:object w:dxaOrig="560" w:dyaOrig="360" w14:anchorId="0EA67858">
+          <v:shape id="_x0000_i1036" type="#_x0000_t75" style="width:28.25pt;height:18.3pt" o:ole="">
             <v:imagedata r:id="rId30" o:title=""/>
           </v:shape>
-          <o:OLEObject Type="Embed" ProgID="Equation.3" ShapeID="_x0000_i1037" DrawAspect="Content" ObjectID="_1840520107" r:id="rId31"/>
+          <o:OLEObject Type="Embed" ProgID="Equation.3" ShapeID="_x0000_i1036" DrawAspect="Content" ObjectID="_1840865216" r:id="rId31"/>
+        </w:object>
+      </w:r>
+      <w:r>
+        <w:rPr>
+          <w:rFonts w:hint="eastAsia"/>
+        </w:rPr>
+        <w:t xml:space="preserve"> </w:t>
+      </w:r>
+      <w:r>
+        <w:rPr>
+          <w:rFonts w:hint="eastAsia"/>
+        </w:rPr>
+        <w:t>：</w:t>
+      </w:r>
+      <w:r>
+        <w:rPr>
+          <w:position w:val="-10"/>
+        </w:rPr>
+        <w:object w:dxaOrig="900" w:dyaOrig="320" w14:anchorId="236385A3">
+          <v:shape id="_x0000_i1037" type="#_x0000_t75" style="width:44.85pt;height:16.05pt" o:ole="">
+            <v:imagedata r:id="rId32" o:title=""/>
+          </v:shape>
+          <o:OLEObject Type="Embed" ProgID="Equation.3" ShapeID="_x0000_i1037" DrawAspect="Content" ObjectID="_1840865217" r:id="rId33"/>
         </w:object>
       </w:r>
       <w:r>
@@ -2753,10 +2753,10 @@
           <w:position w:val="-12"/>
         </w:rPr>
         <w:object w:dxaOrig="580" w:dyaOrig="360" w14:anchorId="3C0A8480">
-          <v:shape id="_x0000_i1038" type="#_x0000_t75" style="width:29pt;height:18pt" o:ole="">
-            <v:imagedata r:id="rId32" o:title=""/>
+          <v:shape id="_x0000_i1038" type="#_x0000_t75" style="width:28.8pt;height:18.3pt" o:ole="">
+            <v:imagedata r:id="rId34" o:title=""/>
           </v:shape>
-          <o:OLEObject Type="Embed" ProgID="Equation.3" ShapeID="_x0000_i1038" DrawAspect="Content" ObjectID="_1840520108" r:id="rId33"/>
+          <o:OLEObject Type="Embed" ProgID="Equation.3" ShapeID="_x0000_i1038" DrawAspect="Content" ObjectID="_1840865218" r:id="rId35"/>
         </w:object>
       </w:r>
       <w:r>
@@ -2860,14 +2860,137 @@
         <w:rPr>
           <w:color w:val="000000"/>
           <w:sz w:val="24"/>
+        </w:rPr>
+      </w:pPr>
+      <w:r>
+        <w:rPr>
+          <w:rFonts w:hint="eastAsia"/>
+        </w:rPr>
+        <w:t>2.</w:t>
+      </w:r>
+      <w:r>
+        <w:t>令</w:t>
+      </w:r>
+      <w:r>
+        <w:rPr>
+          <w:color w:val="000000"/>
+          <w:sz w:val="24"/>
+        </w:rPr>
+        <w:t>x</w:t>
+      </w:r>
+      <w:r>
+        <w:rPr>
+          <w:rFonts w:hint="eastAsia"/>
+          <w:color w:val="000000"/>
+          <w:sz w:val="24"/>
+          <w:vertAlign w:val="subscript"/>
+        </w:rPr>
+        <w:t>7</w:t>
+      </w:r>
+      <w:r>
+        <w:rPr>
+          <w:color w:val="000000"/>
+          <w:sz w:val="24"/>
+        </w:rPr>
+        <w:t>(n) = x</w:t>
+      </w:r>
+      <w:r>
+        <w:rPr>
+          <w:color w:val="000000"/>
+          <w:sz w:val="24"/>
+          <w:vertAlign w:val="subscript"/>
+        </w:rPr>
+        <w:t>4</w:t>
+      </w:r>
+      <w:r>
+        <w:rPr>
+          <w:color w:val="000000"/>
+          <w:sz w:val="24"/>
+        </w:rPr>
+        <w:t>(n) + x</w:t>
+      </w:r>
+      <w:r>
+        <w:rPr>
+          <w:color w:val="000000"/>
+          <w:sz w:val="24"/>
+          <w:vertAlign w:val="subscript"/>
+        </w:rPr>
+        <w:t>5</w:t>
+      </w:r>
+      <w:r>
+        <w:rPr>
+          <w:color w:val="000000"/>
+          <w:sz w:val="24"/>
+        </w:rPr>
+        <w:t>(n)</w:t>
+      </w:r>
+      <w:r>
+        <w:rPr>
+          <w:color w:val="000000"/>
+          <w:sz w:val="24"/>
+        </w:rPr>
+        <w:t>，</w:t>
+      </w:r>
+      <w:r>
+        <w:t>用</w:t>
+      </w:r>
+      <w:r>
+        <w:t>FFT</w:t>
+      </w:r>
+      <w:r>
+        <w:t>计算</w:t>
+      </w:r>
+      <w:r>
+        <w:rPr>
+          <w:rFonts w:hint="eastAsia"/>
+        </w:rPr>
+        <w:t>8</w:t>
+      </w:r>
+      <w:r>
+        <w:rPr>
+          <w:rFonts w:hint="eastAsia"/>
+        </w:rPr>
+        <w:t>点和</w:t>
+      </w:r>
+      <w:r>
+        <w:t>16</w:t>
+      </w:r>
+      <w:r>
+        <w:t>点离散傅里叶变换</w:t>
+      </w:r>
+      <w:r>
+        <w:t>，</w:t>
+      </w:r>
+    </w:p>
+    <w:p>
+      <w:pPr>
+        <w:spacing w:line="400" w:lineRule="exact"/>
+        <w:jc w:val="center"/>
+        <w:rPr>
+          <w:color w:val="000000"/>
+          <w:sz w:val="24"/>
+        </w:rPr>
+      </w:pPr>
+      <w:r>
+        <w:rPr>
+          <w:color w:val="000000"/>
+          <w:sz w:val="24"/>
+        </w:rPr>
+        <w:t>X(k) = DFT [x(n)]</w:t>
+      </w:r>
+    </w:p>
+    <w:p>
+      <w:pPr>
+        <w:rPr>
           <w:lang w:val="pt-BR"/>
         </w:rPr>
       </w:pPr>
       <w:r>
         <w:rPr>
           <w:rFonts w:hint="eastAsia"/>
-        </w:rPr>
-        <w:t>2.</w:t>
+          <w:lang w:val="pt-BR"/>
+        </w:rPr>
+        <w:t>3.</w:t>
       </w:r>
       <w:r>
         <w:t>令</w:t>
@@ -2883,28 +3006,12 @@
       <w:r>
         <w:rPr>
           <w:rFonts w:hint="eastAsia"/>
-          <w:color w:val="000000"/>
-          <w:sz w:val="24"/>
-          <w:vertAlign w:val="subscript"/>
-        </w:rPr>
-        <w:t>7</w:t>
-      </w:r>
-      <w:r>
-        <w:rPr>
-          <w:color w:val="000000"/>
-          <w:sz w:val="24"/>
-          <w:lang w:val="pt-BR"/>
-        </w:rPr>
-        <w:t>(n) = x</w:t>
-      </w:r>
-      <w:r>
-        <w:rPr>
           <w:color w:val="000000"/>
           <w:sz w:val="24"/>
           <w:vertAlign w:val="subscript"/>
           <w:lang w:val="pt-BR"/>
         </w:rPr>
-        <w:t>4</w:t>
+        <w:t>8</w:t>
       </w:r>
       <w:r>
         <w:rPr>
@@ -2912,7 +3019,7 @@
           <w:sz w:val="24"/>
           <w:lang w:val="pt-BR"/>
         </w:rPr>
-        <w:t>(n) + x</w:t>
+        <w:t>(n) = x</w:t>
       </w:r>
       <w:r>
         <w:rPr>
@@ -2921,7 +3028,7 @@
           <w:vertAlign w:val="subscript"/>
           <w:lang w:val="pt-BR"/>
         </w:rPr>
-        <w:t>5</w:t>
+        <w:t>4</w:t>
       </w:r>
       <w:r>
         <w:rPr>
@@ -2929,109 +3036,16 @@
           <w:sz w:val="24"/>
           <w:lang w:val="pt-BR"/>
         </w:rPr>
-        <w:t>(n)</w:t>
-      </w:r>
-      <w:r>
-        <w:rPr>
-          <w:color w:val="000000"/>
-          <w:sz w:val="24"/>
-          <w:lang w:val="pt-BR"/>
-        </w:rPr>
-        <w:t>，</w:t>
-      </w:r>
-      <w:r>
-        <w:t>用</w:t>
-      </w:r>
-      <w:r>
-        <w:rPr>
-          <w:lang w:val="pt-BR"/>
-        </w:rPr>
-        <w:t>FFT</w:t>
-      </w:r>
-      <w:r>
-        <w:t>计算</w:t>
-      </w:r>
-      <w:r>
-        <w:rPr>
-          <w:rFonts w:hint="eastAsia"/>
-        </w:rPr>
-        <w:t>8</w:t>
-      </w:r>
-      <w:r>
-        <w:rPr>
-          <w:rFonts w:hint="eastAsia"/>
-        </w:rPr>
-        <w:t>点和</w:t>
-      </w:r>
-      <w:r>
-        <w:rPr>
-          <w:lang w:val="pt-BR"/>
-        </w:rPr>
-        <w:t>16</w:t>
-      </w:r>
-      <w:r>
-        <w:t>点离散傅里叶变换</w:t>
-      </w:r>
-      <w:r>
-        <w:rPr>
-          <w:lang w:val="pt-BR"/>
-        </w:rPr>
-        <w:t>，</w:t>
-      </w:r>
-    </w:p>
-    <w:p>
-      <w:pPr>
-        <w:spacing w:line="400" w:lineRule="exact"/>
-        <w:jc w:val="center"/>
-        <w:rPr>
-          <w:color w:val="000000"/>
-          <w:sz w:val="24"/>
-          <w:lang w:val="pt-BR"/>
-        </w:rPr>
-      </w:pPr>
-      <w:r>
-        <w:rPr>
-          <w:color w:val="000000"/>
-          <w:sz w:val="24"/>
-          <w:lang w:val="pt-BR"/>
-        </w:rPr>
-        <w:t>X(k) = DFT [x(n)]</w:t>
-      </w:r>
-    </w:p>
-    <w:p>
-      <w:pPr>
-        <w:rPr>
-          <w:rFonts w:hint="eastAsia"/>
-          <w:lang w:val="pt-BR"/>
-        </w:rPr>
-      </w:pPr>
-      <w:r>
-        <w:rPr>
-          <w:rFonts w:hint="eastAsia"/>
-          <w:lang w:val="pt-BR"/>
-        </w:rPr>
-        <w:t>3.</w:t>
-      </w:r>
-      <w:r>
-        <w:t>令</w:t>
-      </w:r>
-      <w:r>
-        <w:rPr>
-          <w:color w:val="000000"/>
-          <w:sz w:val="24"/>
-          <w:lang w:val="pt-BR"/>
-        </w:rPr>
-        <w:t>x</w:t>
-      </w:r>
-      <w:r>
-        <w:rPr>
-          <w:rFonts w:hint="eastAsia"/>
+        <w:t>(n) + j x</w:t>
+      </w:r>
+      <w:r>
+        <w:rPr>
           <w:color w:val="000000"/>
           <w:sz w:val="24"/>
           <w:vertAlign w:val="subscript"/>
           <w:lang w:val="pt-BR"/>
         </w:rPr>
-        <w:t>8</w:t>
+        <w:t>5</w:t>
       </w:r>
       <w:r>
         <w:rPr>
@@ -3039,16 +3053,7 @@
           <w:sz w:val="24"/>
           <w:lang w:val="pt-BR"/>
         </w:rPr>
-        <w:t>(n) = x</w:t>
-      </w:r>
-      <w:r>
-        <w:rPr>
-          <w:color w:val="000000"/>
-          <w:sz w:val="24"/>
-          <w:vertAlign w:val="subscript"/>
-          <w:lang w:val="pt-BR"/>
-        </w:rPr>
-        <w:t>4</w:t>
+        <w:t>(n)</w:t>
       </w:r>
       <w:r>
         <w:rPr>
@@ -3056,16 +3061,14 @@
           <w:sz w:val="24"/>
           <w:lang w:val="pt-BR"/>
         </w:rPr>
-        <w:t>(n) + j x</w:t>
+        <w:t>，</w:t>
       </w:r>
       <w:r>
         <w:rPr>
           <w:color w:val="000000"/>
           <w:sz w:val="24"/>
-          <w:vertAlign w:val="subscript"/>
-          <w:lang w:val="pt-BR"/>
-        </w:rPr>
-        <w:t>5</w:t>
+        </w:rPr>
+        <w:t>重复</w:t>
       </w:r>
       <w:r>
         <w:rPr>
@@ -3073,35 +3076,12 @@
           <w:sz w:val="24"/>
           <w:lang w:val="pt-BR"/>
         </w:rPr>
-        <w:t>(n)</w:t>
+        <w:t>(2)</w:t>
       </w:r>
       <w:r>
         <w:rPr>
           <w:color w:val="000000"/>
           <w:sz w:val="24"/>
-          <w:lang w:val="pt-BR"/>
-        </w:rPr>
-        <w:t>，</w:t>
-      </w:r>
-      <w:r>
-        <w:rPr>
-          <w:color w:val="000000"/>
-          <w:sz w:val="24"/>
-        </w:rPr>
-        <w:t>重复</w:t>
-      </w:r>
-      <w:r>
-        <w:rPr>
-          <w:color w:val="000000"/>
-          <w:sz w:val="24"/>
-          <w:lang w:val="pt-BR"/>
-        </w:rPr>
-        <w:t>(2)</w:t>
-      </w:r>
-      <w:r>
-        <w:rPr>
-          <w:color w:val="000000"/>
-          <w:sz w:val="24"/>
         </w:rPr>
         <w:t>。</w:t>
       </w:r>
@@ -3164,29 +3144,10 @@
           <w:szCs w:val="21"/>
         </w:rPr>
         <w:object w:dxaOrig="639" w:dyaOrig="279" w14:anchorId="7A89E482">
-          <v:shape id="_x0000_i1039" type="#_x0000_t75" style="width:32pt;height:14pt" o:ole="">
-            <v:imagedata r:id="rId34" o:title=""/>
-          </v:shape>
-          <o:OLEObject Type="Embed" ProgID="Equation.3" ShapeID="_x0000_i1039" DrawAspect="Content" ObjectID="_1840520109" r:id="rId35"/>
-        </w:object>
-      </w:r>
-      <w:r>
-        <w:rPr>
-          <w:rFonts w:hint="eastAsia"/>
-          <w:szCs w:val="21"/>
-        </w:rPr>
-        <w:t>时，</w:t>
-      </w:r>
-      <w:r>
-        <w:rPr>
-          <w:position w:val="-10"/>
-          <w:szCs w:val="21"/>
-        </w:rPr>
-        <w:object w:dxaOrig="580" w:dyaOrig="340" w14:anchorId="17105068">
-          <v:shape id="_x0000_i1040" type="#_x0000_t75" style="width:29pt;height:17pt" o:ole="">
+          <v:shape id="_x0000_i1039" type="#_x0000_t75" style="width:32.1pt;height:13.85pt" o:ole="">
             <v:imagedata r:id="rId36" o:title=""/>
           </v:shape>
-          <o:OLEObject Type="Embed" ProgID="Equation.3" ShapeID="_x0000_i1040" DrawAspect="Content" ObjectID="_1840520110" r:id="rId37"/>
+          <o:OLEObject Type="Embed" ProgID="Equation.3" ShapeID="_x0000_i1039" DrawAspect="Content" ObjectID="_1840865219" r:id="rId37"/>
         </w:object>
       </w:r>
       <w:r>
@@ -3194,18 +3155,18 @@
           <w:rFonts w:hint="eastAsia"/>
           <w:szCs w:val="21"/>
         </w:rPr>
-        <w:t>和</w:t>
-      </w:r>
-      <w:r>
-        <w:rPr>
-          <w:position w:val="-12"/>
-          <w:szCs w:val="21"/>
-        </w:rPr>
-        <w:object w:dxaOrig="560" w:dyaOrig="360" w14:anchorId="67E95EF3">
-          <v:shape id="_x0000_i1041" type="#_x0000_t75" style="width:28pt;height:18pt" o:ole="">
+        <w:t>时，</w:t>
+      </w:r>
+      <w:r>
+        <w:rPr>
+          <w:position w:val="-10"/>
+          <w:szCs w:val="21"/>
+        </w:rPr>
+        <w:object w:dxaOrig="580" w:dyaOrig="340" w14:anchorId="17105068">
+          <v:shape id="_x0000_i1040" type="#_x0000_t75" style="width:28.8pt;height:17.15pt" o:ole="">
             <v:imagedata r:id="rId38" o:title=""/>
           </v:shape>
-          <o:OLEObject Type="Embed" ProgID="Equation.3" ShapeID="_x0000_i1041" DrawAspect="Content" ObjectID="_1840520111" r:id="rId39"/>
+          <o:OLEObject Type="Embed" ProgID="Equation.3" ShapeID="_x0000_i1040" DrawAspect="Content" ObjectID="_1840865220" r:id="rId39"/>
         </w:object>
       </w:r>
       <w:r>
@@ -3213,18 +3174,37 @@
           <w:rFonts w:hint="eastAsia"/>
           <w:szCs w:val="21"/>
         </w:rPr>
-        <w:t>的幅频特性会相同吗？为什么？</w:t>
-      </w:r>
-      <w:r>
-        <w:rPr>
-          <w:position w:val="-6"/>
-          <w:szCs w:val="21"/>
-        </w:rPr>
-        <w:object w:dxaOrig="740" w:dyaOrig="279" w14:anchorId="7EEC80D1">
-          <v:shape id="_x0000_i1042" type="#_x0000_t75" style="width:37pt;height:14pt" o:ole="">
+        <w:t>和</w:t>
+      </w:r>
+      <w:r>
+        <w:rPr>
+          <w:position w:val="-12"/>
+          <w:szCs w:val="21"/>
+        </w:rPr>
+        <w:object w:dxaOrig="560" w:dyaOrig="360" w14:anchorId="67E95EF3">
+          <v:shape id="_x0000_i1041" type="#_x0000_t75" style="width:28.25pt;height:18.3pt" o:ole="">
             <v:imagedata r:id="rId40" o:title=""/>
           </v:shape>
-          <o:OLEObject Type="Embed" ProgID="Equation.3" ShapeID="_x0000_i1042" DrawAspect="Content" ObjectID="_1840520112" r:id="rId41"/>
+          <o:OLEObject Type="Embed" ProgID="Equation.3" ShapeID="_x0000_i1041" DrawAspect="Content" ObjectID="_1840865221" r:id="rId41"/>
+        </w:object>
+      </w:r>
+      <w:r>
+        <w:rPr>
+          <w:rFonts w:hint="eastAsia"/>
+          <w:szCs w:val="21"/>
+        </w:rPr>
+        <w:t>的幅频特性会相同吗？为什么？</w:t>
+      </w:r>
+      <w:r>
+        <w:rPr>
+          <w:position w:val="-6"/>
+          <w:szCs w:val="21"/>
+        </w:rPr>
+        <w:object w:dxaOrig="740" w:dyaOrig="279" w14:anchorId="7EEC80D1">
+          <v:shape id="_x0000_i1042" type="#_x0000_t75" style="width:37.1pt;height:13.85pt" o:ole="">
+            <v:imagedata r:id="rId42" o:title=""/>
+          </v:shape>
+          <o:OLEObject Type="Embed" ProgID="Equation.3" ShapeID="_x0000_i1042" DrawAspect="Content" ObjectID="_1840865222" r:id="rId43"/>
         </w:object>
       </w:r>
       <w:r>
@@ -3386,6 +3366,44 @@
     </w:sectPr>
   </w:body>
 </w:document>
+</file>
+
+<file path=word/endnotes.xml><?xml version="1.0" encoding="utf-8"?>
+<w:endnotes xmlns:wpc="http://schemas.microsoft.com/office/word/2010/wordprocessingCanvas" xmlns:cx="http://schemas.microsoft.com/office/drawing/2014/chartex" xmlns:cx1="http://schemas.microsoft.com/office/drawing/2015/9/8/chartex" xmlns:cx2="http://schemas.microsoft.com/office/drawing/2015/10/21/chartex" xmlns:cx3="http://schemas.microsoft.com/office/drawing/2016/5/9/chartex" xmlns:cx4="http://schemas.microsoft.com/office/drawing/2016/5/10/chartex" xmlns:cx5="http://schemas.microsoft.com/office/drawing/2016/5/11/chartex" xmlns:cx6="http://schemas.microsoft.com/office/drawing/2016/5/12/chartex" xmlns:cx7="http://schemas.microsoft.com/office/drawing/2016/5/13/chartex" xmlns:cx8="http://schemas.microsoft.com/office/drawing/2016/5/14/chartex" xmlns:mc="http://schemas.openxmlformats.org/markup-compatibility/2006" xmlns:aink="http://schemas.microsoft.com/office/drawing/2016/ink" xmlns:am3d="http://schemas.microsoft.com/office/drawing/2017/model3d" xmlns:o="urn:schemas-microsoft-com:office:office" xmlns:oel="http://schemas.microsoft.com/office/2019/extlst" xmlns:r="http://schemas.openxmlformats.org/officeDocument/2006/relationships" xmlns:m="http://schemas.openxmlformats.org/officeDocument/2006/math" xmlns:v="urn:schemas-microsoft-com:vml" xmlns:wp14="http://schemas.microsoft.com/office/word/2010/wordprocessingDrawing" xmlns:wp="http://schemas.openxmlformats.org/drawingml/2006/wordprocessingDrawing" xmlns:w10="urn:schemas-microsoft-com:office:word" xmlns:w="http://schemas.openxmlformats.org/wordprocessingml/2006/main" xmlns:w14="http://schemas.microsoft.com/office/word/2010/wordml" xmlns:w15="http://schemas.microsoft.com/office/word/2012/wordml" xmlns:w16cex="http://schemas.microsoft.com/office/word/2018/wordml/cex" xmlns:w16cid="http://schemas.microsoft.com/office/word/2016/wordml/cid" xmlns:w16="http://schemas.microsoft.com/office/word/2018/wordml" xmlns:w16du="http://schemas.microsoft.com/office/word/2023/wordml/word16du" xmlns:w16sdtdh="http://schemas.microsoft.com/office/word/2020/wordml/sdtdatahash" xmlns:w16sdtfl="http://schemas.microsoft.com/office/word/2024/wordml/sdtformatlock" xmlns:w16se="http://schemas.microsoft.com/office/word/2015/wordml/symex" xmlns:wpg="http://schemas.microsoft.com/office/word/2010/wordprocessingGroup" xmlns:wpi="http://schemas.microsoft.com/office/word/2010/wordprocessingInk" xmlns:wne="http://schemas.microsoft.com/office/word/2006/wordml" xmlns:wps="http://schemas.microsoft.com/office/word/2010/wordprocessingShape" mc:Ignorable="w14 w15 w16se w16cid w16 w16cex w16sdtdh w16sdtfl w16du wp14">
+  <w:endnote w:type="separator" w:id="-1">
+    <w:p>
+      <w:r>
+        <w:separator/>
+      </w:r>
+    </w:p>
+  </w:endnote>
+  <w:endnote w:type="continuationSeparator" w:id="0">
+    <w:p>
+      <w:r>
+        <w:continuationSeparator/>
+      </w:r>
+    </w:p>
+  </w:endnote>
+</w:endnotes>
+</file>
+
+<file path=word/footnotes.xml><?xml version="1.0" encoding="utf-8"?>
+<w:footnotes xmlns:wpc="http://schemas.microsoft.com/office/word/2010/wordprocessingCanvas" xmlns:cx="http://schemas.microsoft.com/office/drawing/2014/chartex" xmlns:cx1="http://schemas.microsoft.com/office/drawing/2015/9/8/chartex" xmlns:cx2="http://schemas.microsoft.com/office/drawing/2015/10/21/chartex" xmlns:cx3="http://schemas.microsoft.com/office/drawing/2016/5/9/chartex" xmlns:cx4="http://schemas.microsoft.com/office/drawing/2016/5/10/chartex" xmlns:cx5="http://schemas.microsoft.com/office/drawing/2016/5/11/chartex" xmlns:cx6="http://schemas.microsoft.com/office/drawing/2016/5/12/chartex" xmlns:cx7="http://schemas.microsoft.com/office/drawing/2016/5/13/chartex" xmlns:cx8="http://schemas.microsoft.com/office/drawing/2016/5/14/chartex" xmlns:mc="http://schemas.openxmlformats.org/markup-compatibility/2006" xmlns:aink="http://schemas.microsoft.com/office/drawing/2016/ink" xmlns:am3d="http://schemas.microsoft.com/office/drawing/2017/model3d" xmlns:o="urn:schemas-microsoft-com:office:office" xmlns:oel="http://schemas.microsoft.com/office/2019/extlst" xmlns:r="http://schemas.openxmlformats.org/officeDocument/2006/relationships" xmlns:m="http://schemas.openxmlformats.org/officeDocument/2006/math" xmlns:v="urn:schemas-microsoft-com:vml" xmlns:wp14="http://schemas.microsoft.com/office/word/2010/wordprocessingDrawing" xmlns:wp="http://schemas.openxmlformats.org/drawingml/2006/wordprocessingDrawing" xmlns:w10="urn:schemas-microsoft-com:office:word" xmlns:w="http://schemas.openxmlformats.org/wordprocessingml/2006/main" xmlns:w14="http://schemas.microsoft.com/office/word/2010/wordml" xmlns:w15="http://schemas.microsoft.com/office/word/2012/wordml" xmlns:w16cex="http://schemas.microsoft.com/office/word/2018/wordml/cex" xmlns:w16cid="http://schemas.microsoft.com/office/word/2016/wordml/cid" xmlns:w16="http://schemas.microsoft.com/office/word/2018/wordml" xmlns:w16du="http://schemas.microsoft.com/office/word/2023/wordml/word16du" xmlns:w16sdtdh="http://schemas.microsoft.com/office/word/2020/wordml/sdtdatahash" xmlns:w16sdtfl="http://schemas.microsoft.com/office/word/2024/wordml/sdtformatlock" xmlns:w16se="http://schemas.microsoft.com/office/word/2015/wordml/symex" xmlns:wpg="http://schemas.microsoft.com/office/word/2010/wordprocessingGroup" xmlns:wpi="http://schemas.microsoft.com/office/word/2010/wordprocessingInk" xmlns:wne="http://schemas.microsoft.com/office/word/2006/wordml" xmlns:wps="http://schemas.microsoft.com/office/word/2010/wordprocessingShape" mc:Ignorable="w14 w15 w16se w16cid w16 w16cex w16sdtdh w16sdtfl w16du wp14">
+  <w:footnote w:type="separator" w:id="-1">
+    <w:p>
+      <w:r>
+        <w:separator/>
+      </w:r>
+    </w:p>
+  </w:footnote>
+  <w:footnote w:type="continuationSeparator" w:id="0">
+    <w:p>
+      <w:r>
+        <w:continuationSeparator/>
+      </w:r>
+    </w:p>
+  </w:footnote>
+</w:footnotes>
 </file>
 
 <file path=word/numbering.xml><?xml version="1.0" encoding="utf-8"?>

</xml_diff>